<commit_message>
fix: docx formatting preserved and mapped correlativo and fecha_pago
</commit_message>
<xml_diff>
--- a/plantilla_caja_huancayo_v2.docx
+++ b/plantilla_caja_huancayo_v2.docx
@@ -129,8 +129,60 @@
           <w:szCs w:val="22"/>
         </w:rPr>
       </w:pPr>
-      <w:r>
-        <w:t>SEÑOR (A) (ES): [NOMBRE_CLIENTE]</w:t>
+      <w:bookmarkStart w:id="2" w:name="_Hlk179496434"/>
+      <w:r>
+        <w:rPr>
+          <w:rFonts w:ascii="Arial Narrow" w:hAnsi="Arial Narrow"/>
+          <w:bCs/>
+          <w:szCs w:val="18"/>
+        </w:rPr>
+        <w:t xml:space="preserve">SEÑOR (A) (ES): </w:t>
+      </w:r>
+      <w:bookmarkEnd w:id="2"/>
+      <w:r>
+        <w:rPr>
+          <w:rFonts w:ascii="Arial Narrow" w:hAnsi="Arial Narrow"/>
+          <w:b/>
+          <w:sz w:val="32"/>
+          <w:szCs w:val="22"/>
+        </w:rPr>
+        <w:fldChar w:fldCharType="begin"/>
+      </w:r>
+      <w:r>
+        <w:rPr>
+          <w:rFonts w:ascii="Arial Narrow" w:hAnsi="Arial Narrow"/>
+          <w:b/>
+          <w:sz w:val="32"/>
+          <w:szCs w:val="22"/>
+        </w:rPr>
+        <w:instrText xml:space="preserve"> MERGEFIELD Cliente </w:instrText>
+      </w:r>
+      <w:r>
+        <w:rPr>
+          <w:rFonts w:ascii="Arial Narrow" w:hAnsi="Arial Narrow"/>
+          <w:b/>
+          <w:sz w:val="32"/>
+          <w:szCs w:val="22"/>
+        </w:rPr>
+        <w:fldChar w:fldCharType="separate"/>
+      </w:r>
+      <w:r>
+        <w:rPr>
+          <w:rFonts w:ascii="Arial Narrow" w:hAnsi="Arial Narrow"/>
+          <w:b/>
+          <w:noProof/>
+          <w:sz w:val="32"/>
+        </w:rPr>
+        <w:t>[NOMBRE_CLIENTE]</w:t>
+      </w:r>
+      <w:r>
+        <w:rPr>
+          <w:rFonts w:ascii="Arial Narrow" w:hAnsi="Arial Narrow"/>
+          <w:b/>
+          <w:sz w:val="32"/>
+          <w:szCs w:val="22"/>
+        </w:rPr>
+        <w:fldChar w:fldCharType="end"/>
       </w:r>
     </w:p>
     <w:p>
@@ -151,7 +203,63 @@
         </w:rPr>
       </w:pPr>
       <w:r>
-        <w:t xml:space="preserve">CUENTA: [NUM_CUENTA]                                                           N° de Carta al cliente: </w:t>
+        <w:t>CUENTA:</w:t>
+      </w:r>
+      <w:r>
+        <w:rPr>
+          <w:noProof/>
+        </w:rPr>
+        <w:t xml:space="preserve"> </w:t>
+      </w:r>
+      <w:r>
+        <w:rPr>
+          <w:noProof/>
+        </w:rPr>
+        <w:fldChar w:fldCharType="begin"/>
+      </w:r>
+      <w:r>
+        <w:rPr>
+          <w:noProof/>
+        </w:rPr>
+        <w:instrText xml:space="preserve"> MERGEFIELD Cuenta </w:instrText>
+      </w:r>
+      <w:r>
+        <w:rPr>
+          <w:noProof/>
+        </w:rPr>
+        <w:fldChar w:fldCharType="separate"/>
+      </w:r>
+      <w:r>
+        <w:rPr>
+          <w:noProof/>
+        </w:rPr>
+        <w:t>[NUM_CUENTA]</w:t>
+      </w:r>
+      <w:r>
+        <w:rPr>
+          <w:noProof/>
+        </w:rPr>
+        <w:fldChar w:fldCharType="end"/>
+      </w:r>
+      <w:r>
+        <w:rPr>
+          <w:noProof/>
+        </w:rPr>
+        <w:t xml:space="preserve">                                                         </w:t>
+      </w:r>
+      <w:r>
+        <w:rPr>
+          <w:noProof/>
+        </w:rPr>
+        <w:t xml:space="preserve">  </w:t>
+      </w:r>
+      <w:r>
+        <w:rPr>
+          <w:b/>
+          <w:bCs/>
+          <w:noProof/>
+        </w:rPr>
+        <w:t xml:space="preserve">N° de Carta al cliente: </w:t>
       </w:r>
     </w:p>
     <w:p>
@@ -166,8 +274,125 @@
         </w:rPr>
       </w:pPr>
       <w:r>
+        <w:rPr>
+          <w:rFonts w:ascii="Arial Narrow" w:hAnsi="Arial Narrow" w:cs="Arial"/>
+          <w:bCs/>
+          <w:sz w:val="24"/>
+          <w:szCs w:val="18"/>
+          <w:lang w:val="pt-BR"/>
+        </w:rPr>
         <w:t>DOMICILIO: [DIRECCION_CLIENTE]</w:t>
       </w:r>
+      <w:r>
+        <w:rPr>
+          <w:rFonts w:ascii="Arial Narrow" w:hAnsi="Arial Narrow" w:cs="Arial"/>
+          <w:bCs/>
+          <w:sz w:val="24"/>
+          <w:szCs w:val="18"/>
+          <w:lang w:val="pt-BR"/>
+        </w:rPr>
+      </w:r>
+      <w:r>
+        <w:rPr>
+          <w:rFonts w:ascii="Arial Narrow" w:hAnsi="Arial Narrow" w:cs="Arial"/>
+          <w:bCs/>
+          <w:sz w:val="24"/>
+          <w:szCs w:val="18"/>
+          <w:lang w:val="pt-BR"/>
+        </w:rPr>
+      </w:r>
+      <w:r>
+        <w:rPr>
+          <w:rFonts w:ascii="Arial Narrow" w:hAnsi="Arial Narrow" w:cs="Arial"/>
+          <w:bCs/>
+          <w:sz w:val="24"/>
+          <w:szCs w:val="18"/>
+          <w:lang w:val="pt-BR"/>
+        </w:rPr>
+      </w:r>
+      <w:r>
+        <w:rPr>
+          <w:rFonts w:ascii="Arial Narrow" w:hAnsi="Arial Narrow" w:cs="Arial"/>
+          <w:bCs/>
+          <w:sz w:val="24"/>
+          <w:szCs w:val="18"/>
+          <w:lang w:val="pt-BR"/>
+        </w:rPr>
+      </w:r>
+      <w:r>
+        <w:rPr>
+          <w:rFonts w:ascii="Arial Narrow" w:hAnsi="Arial Narrow" w:cs="Arial"/>
+          <w:bCs/>
+          <w:noProof/>
+          <w:sz w:val="24"/>
+          <w:szCs w:val="18"/>
+          <w:lang w:val="pt-BR"/>
+        </w:rPr>
+      </w:r>
+      <w:r>
+        <w:rPr>
+          <w:rFonts w:ascii="Arial Narrow" w:hAnsi="Arial Narrow" w:cs="Arial"/>
+          <w:bCs/>
+          <w:sz w:val="24"/>
+          <w:szCs w:val="18"/>
+          <w:lang w:val="pt-BR"/>
+        </w:rPr>
+      </w:r>
+      <w:r>
+        <w:rPr>
+          <w:rFonts w:ascii="Arial Narrow" w:hAnsi="Arial Narrow" w:cs="Arial"/>
+          <w:bCs/>
+          <w:sz w:val="24"/>
+          <w:szCs w:val="18"/>
+          <w:lang w:val="pt-BR"/>
+        </w:rPr>
+      </w:r>
+      <w:r>
+        <w:rPr>
+          <w:rFonts w:ascii="Arial Narrow" w:hAnsi="Arial Narrow" w:cs="Arial"/>
+          <w:bCs/>
+          <w:sz w:val="24"/>
+          <w:szCs w:val="18"/>
+          <w:lang w:val="pt-BR"/>
+        </w:rPr>
+      </w:r>
+      <w:r>
+        <w:rPr>
+          <w:rFonts w:ascii="Arial Narrow" w:hAnsi="Arial Narrow" w:cs="Arial"/>
+          <w:bCs/>
+          <w:sz w:val="24"/>
+          <w:szCs w:val="18"/>
+          <w:lang w:val="pt-BR"/>
+        </w:rPr>
+      </w:r>
+      <w:r>
+        <w:rPr>
+          <w:rFonts w:ascii="Arial Narrow" w:hAnsi="Arial Narrow" w:cs="Arial"/>
+          <w:bCs/>
+          <w:sz w:val="24"/>
+          <w:szCs w:val="18"/>
+          <w:lang w:val="pt-BR"/>
+        </w:rPr>
+      </w:r>
+      <w:r>
+        <w:rPr>
+          <w:rFonts w:ascii="Arial Narrow" w:hAnsi="Arial Narrow" w:cs="Arial"/>
+          <w:bCs/>
+          <w:noProof/>
+          <w:sz w:val="24"/>
+          <w:szCs w:val="18"/>
+          <w:lang w:val="pt-BR"/>
+        </w:rPr>
+      </w:r>
+      <w:r>
+        <w:rPr>
+          <w:rFonts w:ascii="Arial Narrow" w:hAnsi="Arial Narrow" w:cs="Arial"/>
+          <w:bCs/>
+          <w:sz w:val="24"/>
+          <w:szCs w:val="18"/>
+          <w:lang w:val="pt-BR"/>
+        </w:rPr>
+      </w:r>
     </w:p>
     <w:p>
       <w:pPr>
@@ -181,7 +406,68 @@
         </w:rPr>
       </w:pPr>
       <w:r>
-        <w:t>AVAL: [NOMBRE_AVAL]</w:t>
+        <w:rPr>
+          <w:rFonts w:ascii="Arial Narrow" w:hAnsi="Arial Narrow"/>
+          <w:b/>
+          <w:noProof/>
+          <w:szCs w:val="18"/>
+        </w:rPr>
+        <w:t>AVAL:</w:t>
+      </w:r>
+      <w:r>
+        <w:rPr>
+          <w:rFonts w:ascii="Arial Narrow" w:hAnsi="Arial Narrow"/>
+          <w:b/>
+          <w:noProof/>
+          <w:sz w:val="28"/>
+        </w:rPr>
+        <w:t xml:space="preserve"> </w:t>
+      </w:r>
+      <w:r>
+        <w:rPr>
+          <w:rFonts w:ascii="Arial Narrow" w:eastAsia="Arial" w:hAnsi="Arial Narrow" w:cs="Arial"/>
+          <w:b/>
+          <w:sz w:val="32"/>
+          <w:lang w:eastAsia="es-ES"/>
+        </w:rPr>
+        <w:fldChar w:fldCharType="begin"/>
+      </w:r>
+      <w:r>
+        <w:rPr>
+          <w:rFonts w:ascii="Arial Narrow" w:eastAsia="Arial" w:hAnsi="Arial Narrow" w:cs="Arial"/>
+          <w:b/>
+          <w:sz w:val="32"/>
+          <w:lang w:eastAsia="es-ES"/>
+        </w:rPr>
+        <w:instrText xml:space="preserve"> MERGEFIELD Fiador </w:instrText>
+      </w:r>
+      <w:r>
+        <w:rPr>
+          <w:rFonts w:ascii="Arial Narrow" w:eastAsia="Arial" w:hAnsi="Arial Narrow" w:cs="Arial"/>
+          <w:b/>
+          <w:sz w:val="32"/>
+          <w:lang w:eastAsia="es-ES"/>
+        </w:rPr>
+        <w:fldChar w:fldCharType="separate"/>
+      </w:r>
+      <w:r>
+        <w:rPr>
+          <w:rFonts w:ascii="Arial Narrow" w:eastAsia="Arial" w:hAnsi="Arial Narrow" w:cs="Arial"/>
+          <w:b/>
+          <w:noProof/>
+          <w:sz w:val="32"/>
+          <w:lang w:eastAsia="es-ES"/>
+        </w:rPr>
+        <w:t>[NOMBRE_AVAL]</w:t>
+      </w:r>
+      <w:r>
+        <w:rPr>
+          <w:rFonts w:ascii="Arial Narrow" w:eastAsia="Arial" w:hAnsi="Arial Narrow" w:cs="Arial"/>
+          <w:b/>
+          <w:sz w:val="32"/>
+          <w:lang w:eastAsia="es-ES"/>
+        </w:rPr>
+        <w:fldChar w:fldCharType="end"/>
       </w:r>
     </w:p>
     <w:p>
@@ -197,7 +483,132 @@
         </w:rPr>
       </w:pPr>
       <w:r>
+        <w:rPr>
+          <w:rFonts w:ascii="Arial Narrow" w:hAnsi="Arial Narrow" w:cs="Arial"/>
+          <w:bCs/>
+          <w:sz w:val="24"/>
+          <w:szCs w:val="18"/>
+          <w:lang w:val="pt-BR"/>
+        </w:rPr>
         <w:t>DOMICILIO:  [DIRECCION_CLIENTE]</w:t>
+      </w:r>
+      <w:r>
+        <w:rPr>
+          <w:rFonts w:ascii="Arial Narrow" w:hAnsi="Arial Narrow"/>
+          <w:bCs/>
+          <w:noProof/>
+          <w:szCs w:val="18"/>
+        </w:rPr>
+      </w:r>
+      <w:r>
+        <w:rPr>
+          <w:rFonts w:ascii="Arial Narrow" w:hAnsi="Arial Narrow" w:cs="Arial"/>
+          <w:bCs/>
+          <w:noProof/>
+          <w:sz w:val="24"/>
+          <w:szCs w:val="18"/>
+          <w:lang w:val="pt-BR"/>
+        </w:rPr>
+      </w:r>
+      <w:r>
+        <w:rPr>
+          <w:rFonts w:ascii="Arial Narrow" w:hAnsi="Arial Narrow" w:cs="Arial"/>
+          <w:bCs/>
+          <w:noProof/>
+          <w:sz w:val="24"/>
+          <w:szCs w:val="18"/>
+          <w:lang w:val="pt-BR"/>
+        </w:rPr>
+      </w:r>
+      <w:r>
+        <w:rPr>
+          <w:rFonts w:ascii="Arial Narrow" w:hAnsi="Arial Narrow" w:cs="Arial"/>
+          <w:bCs/>
+          <w:noProof/>
+          <w:sz w:val="24"/>
+          <w:szCs w:val="18"/>
+          <w:lang w:val="pt-BR"/>
+        </w:rPr>
+      </w:r>
+      <w:r>
+        <w:rPr>
+          <w:rFonts w:ascii="Arial Narrow" w:hAnsi="Arial Narrow" w:cs="Arial"/>
+          <w:bCs/>
+          <w:noProof/>
+          <w:sz w:val="24"/>
+          <w:szCs w:val="18"/>
+          <w:lang w:val="pt-BR"/>
+        </w:rPr>
+      </w:r>
+      <w:r>
+        <w:rPr>
+          <w:rFonts w:ascii="Arial Narrow" w:hAnsi="Arial Narrow" w:cs="Arial"/>
+          <w:bCs/>
+          <w:noProof/>
+          <w:sz w:val="24"/>
+          <w:szCs w:val="18"/>
+          <w:lang w:val="pt-BR"/>
+        </w:rPr>
+      </w:r>
+      <w:r>
+        <w:rPr>
+          <w:rFonts w:ascii="Arial Narrow" w:hAnsi="Arial Narrow" w:cs="Arial"/>
+          <w:bCs/>
+          <w:noProof/>
+          <w:sz w:val="24"/>
+          <w:szCs w:val="18"/>
+          <w:lang w:val="pt-BR"/>
+        </w:rPr>
+      </w:r>
+      <w:r>
+        <w:rPr>
+          <w:rFonts w:ascii="Arial Narrow" w:hAnsi="Arial Narrow" w:cs="Arial"/>
+          <w:bCs/>
+          <w:noProof/>
+          <w:sz w:val="24"/>
+          <w:szCs w:val="18"/>
+          <w:lang w:val="pt-BR"/>
+        </w:rPr>
+      </w:r>
+      <w:r>
+        <w:rPr>
+          <w:rFonts w:ascii="Arial Narrow" w:hAnsi="Arial Narrow" w:cs="Arial"/>
+          <w:bCs/>
+          <w:noProof/>
+          <w:sz w:val="24"/>
+          <w:szCs w:val="18"/>
+          <w:lang w:val="pt-BR"/>
+        </w:rPr>
+      </w:r>
+      <w:r>
+        <w:rPr>
+          <w:rFonts w:ascii="Arial Narrow" w:hAnsi="Arial Narrow" w:cs="Arial"/>
+          <w:bCs/>
+          <w:noProof/>
+          <w:sz w:val="24"/>
+          <w:szCs w:val="18"/>
+          <w:lang w:val="pt-BR"/>
+        </w:rPr>
+      </w:r>
+      <w:r>
+        <w:rPr>
+          <w:rFonts w:ascii="Arial Narrow" w:hAnsi="Arial Narrow" w:cs="Arial"/>
+          <w:bCs/>
+          <w:noProof/>
+          <w:sz w:val="24"/>
+          <w:szCs w:val="18"/>
+          <w:lang w:val="pt-BR"/>
+        </w:rPr>
+      </w:r>
+      <w:r>
+        <w:rPr>
+          <w:rFonts w:ascii="Arial Narrow" w:hAnsi="Arial Narrow" w:cs="Arial"/>
+          <w:bCs/>
+          <w:noProof/>
+          <w:sz w:val="24"/>
+          <w:szCs w:val="18"/>
+          <w:lang w:val="pt-BR"/>
+        </w:rPr>
       </w:r>
     </w:p>
     <w:p>
@@ -230,7 +641,78 @@
         </w:rPr>
       </w:pPr>
       <w:r>
-        <w:t xml:space="preserve">AGENCIA:[AGENCIA] </w:t>
+        <w:rPr>
+          <w:rFonts w:ascii="Arial Narrow" w:hAnsi="Arial Narrow" w:cs="Arial"/>
+          <w:bCs/>
+          <w:sz w:val="24"/>
+          <w:szCs w:val="18"/>
+          <w:lang w:val="pt-BR"/>
+        </w:rPr>
+        <w:t>A</w:t>
+      </w:r>
+      <w:r>
+        <w:rPr>
+          <w:rFonts w:ascii="Arial Narrow" w:hAnsi="Arial Narrow" w:cs="Arial"/>
+          <w:bCs/>
+          <w:sz w:val="24"/>
+          <w:szCs w:val="18"/>
+        </w:rPr>
+        <w:t>GENCIA:</w:t>
+      </w:r>
+      <w:r>
+        <w:rPr>
+          <w:rFonts w:ascii="Arial Narrow" w:hAnsi="Arial Narrow" w:cs="Arial"/>
+          <w:bCs/>
+          <w:sz w:val="24"/>
+          <w:szCs w:val="18"/>
+        </w:rPr>
+        <w:fldChar w:fldCharType="begin"/>
+      </w:r>
+      <w:r>
+        <w:rPr>
+          <w:rFonts w:ascii="Arial Narrow" w:hAnsi="Arial Narrow" w:cs="Arial"/>
+          <w:bCs/>
+          <w:sz w:val="24"/>
+          <w:szCs w:val="18"/>
+        </w:rPr>
+        <w:instrText xml:space="preserve"> MERGEFIELD Agencia </w:instrText>
+      </w:r>
+      <w:r>
+        <w:rPr>
+          <w:rFonts w:ascii="Arial Narrow" w:hAnsi="Arial Narrow" w:cs="Arial"/>
+          <w:bCs/>
+          <w:sz w:val="24"/>
+          <w:szCs w:val="18"/>
+        </w:rPr>
+        <w:fldChar w:fldCharType="separate"/>
+      </w:r>
+      <w:r>
+        <w:rPr>
+          <w:rFonts w:ascii="Arial Narrow" w:hAnsi="Arial Narrow" w:cs="Arial"/>
+          <w:bCs/>
+          <w:noProof/>
+          <w:sz w:val="24"/>
+          <w:szCs w:val="18"/>
+        </w:rPr>
+        <w:t>[AGENCIA]</w:t>
+      </w:r>
+      <w:r>
+        <w:rPr>
+          <w:rFonts w:ascii="Arial Narrow" w:hAnsi="Arial Narrow" w:cs="Arial"/>
+          <w:bCs/>
+          <w:sz w:val="24"/>
+          <w:szCs w:val="18"/>
+        </w:rPr>
+        <w:fldChar w:fldCharType="end"/>
+      </w:r>
+      <w:r>
+        <w:rPr>
+          <w:rFonts w:ascii="Arial Narrow" w:hAnsi="Arial Narrow" w:cs="Arial"/>
+          <w:bCs/>
+          <w:sz w:val="24"/>
+          <w:szCs w:val="18"/>
+        </w:rPr>
+        <w:t xml:space="preserve"> </w:t>
       </w:r>
     </w:p>
     <w:p>
@@ -559,7 +1041,113 @@
               </w:rPr>
             </w:pPr>
             <w:r>
-              <w:t xml:space="preserve">        S/ [MONTO_DEUDA]</w:t>
+              <w:rPr>
+                <w:rFonts w:ascii="Calibri" w:eastAsia="Times New Roman" w:hAnsi="Calibri" w:cs="Calibri"/>
+                <w:b/>
+                <w:bCs/>
+                <w:color w:val="000000"/>
+                <w:sz w:val="48"/>
+                <w:szCs w:val="48"/>
+                <w:lang w:eastAsia="es-PE"/>
+              </w:rPr>
+              <w:t xml:space="preserve">    </w:t>
+            </w:r>
+            <w:r>
+              <w:rPr>
+                <w:rFonts w:ascii="Calibri" w:eastAsia="Times New Roman" w:hAnsi="Calibri" w:cs="Calibri"/>
+                <w:b/>
+                <w:bCs/>
+                <w:color w:val="000000"/>
+                <w:sz w:val="48"/>
+                <w:szCs w:val="48"/>
+                <w:lang w:eastAsia="es-PE"/>
+              </w:rPr>
+              <w:t xml:space="preserve">    </w:t>
+            </w:r>
+            <w:r>
+              <w:rPr>
+                <w:rFonts w:ascii="Calibri" w:eastAsia="Times New Roman" w:hAnsi="Calibri" w:cs="Calibri"/>
+                <w:b/>
+                <w:bCs/>
+                <w:color w:val="000000"/>
+                <w:sz w:val="48"/>
+                <w:szCs w:val="48"/>
+                <w:lang w:eastAsia="es-PE"/>
+              </w:rPr>
+              <w:t>S/</w:t>
+            </w:r>
+            <w:r>
+              <w:rPr>
+                <w:rFonts w:ascii="Calibri" w:eastAsia="Times New Roman" w:hAnsi="Calibri" w:cs="Calibri"/>
+                <w:b/>
+                <w:bCs/>
+                <w:color w:val="000000"/>
+                <w:sz w:val="48"/>
+                <w:szCs w:val="48"/>
+                <w:lang w:eastAsia="es-PE"/>
+              </w:rPr>
+              <w:t xml:space="preserve"> </w:t>
+            </w:r>
+            <w:r>
+              <w:rPr>
+                <w:rFonts w:ascii="Calibri" w:eastAsia="Times New Roman" w:hAnsi="Calibri" w:cs="Calibri"/>
+                <w:b/>
+                <w:bCs/>
+                <w:color w:val="000000"/>
+                <w:sz w:val="48"/>
+                <w:szCs w:val="48"/>
+                <w:lang w:eastAsia="es-PE"/>
+              </w:rPr>
+              <w:fldChar w:fldCharType="begin"/>
+            </w:r>
+            <w:r>
+              <w:rPr>
+                <w:rFonts w:ascii="Calibri" w:eastAsia="Times New Roman" w:hAnsi="Calibri" w:cs="Calibri"/>
+                <w:b/>
+                <w:bCs/>
+                <w:color w:val="000000"/>
+                <w:sz w:val="48"/>
+                <w:szCs w:val="48"/>
+                <w:lang w:eastAsia="es-PE"/>
+              </w:rPr>
+              <w:instrText xml:space="preserve"> MERGEFIELD Saldo_Total </w:instrText>
+            </w:r>
+            <w:r>
+              <w:rPr>
+                <w:rFonts w:ascii="Calibri" w:eastAsia="Times New Roman" w:hAnsi="Calibri" w:cs="Calibri"/>
+                <w:b/>
+                <w:bCs/>
+                <w:color w:val="000000"/>
+                <w:sz w:val="48"/>
+                <w:szCs w:val="48"/>
+                <w:lang w:eastAsia="es-PE"/>
+              </w:rPr>
+              <w:fldChar w:fldCharType="separate"/>
+            </w:r>
+            <w:r>
+              <w:rPr>
+                <w:rFonts w:ascii="Calibri" w:eastAsia="Times New Roman" w:hAnsi="Calibri" w:cs="Calibri"/>
+                <w:b/>
+                <w:bCs/>
+                <w:noProof/>
+                <w:color w:val="000000"/>
+                <w:sz w:val="48"/>
+                <w:szCs w:val="48"/>
+                <w:lang w:eastAsia="es-PE"/>
+              </w:rPr>
+              <w:t>[MONTO_DEUDA]</w:t>
+            </w:r>
+            <w:r>
+              <w:rPr>
+                <w:rFonts w:ascii="Calibri" w:eastAsia="Times New Roman" w:hAnsi="Calibri" w:cs="Calibri"/>
+                <w:b/>
+                <w:bCs/>
+                <w:color w:val="000000"/>
+                <w:sz w:val="48"/>
+                <w:szCs w:val="48"/>
+                <w:lang w:eastAsia="es-PE"/>
+              </w:rPr>
+              <w:fldChar w:fldCharType="end"/>
             </w:r>
           </w:p>
         </w:tc>
@@ -899,7 +1487,7 @@
           <w:sz w:val="24"/>
           <w:szCs w:val="24"/>
         </w:rPr>
-        <w:t>N° CARTA:1997-2026-CÓDIGO AG. 099 ASESOR LEGAL EXTERNO: LPG/CMACHYO</w:t>
+        <w:t>N° CARTA:[NRO_CARTA]</w:t>
       </w:r>
       <w:r>
         <w:rPr>
@@ -1048,7 +1636,57 @@
         </w:rPr>
       </w:pPr>
       <w:r>
-        <w:t>SEÑOR (A) (ES): [NOMBRE_CLIENTE]</w:t>
+        <w:rPr>
+          <w:rFonts w:ascii="Arial Narrow" w:hAnsi="Arial Narrow"/>
+          <w:bCs/>
+          <w:szCs w:val="18"/>
+        </w:rPr>
+        <w:t xml:space="preserve">SEÑOR (A) (ES): </w:t>
+      </w:r>
+      <w:r>
+        <w:rPr>
+          <w:rFonts w:ascii="Arial Narrow" w:hAnsi="Arial Narrow"/>
+          <w:b/>
+          <w:sz w:val="32"/>
+          <w:szCs w:val="22"/>
+        </w:rPr>
+        <w:fldChar w:fldCharType="begin"/>
+      </w:r>
+      <w:r>
+        <w:rPr>
+          <w:rFonts w:ascii="Arial Narrow" w:hAnsi="Arial Narrow"/>
+          <w:b/>
+          <w:sz w:val="32"/>
+          <w:szCs w:val="22"/>
+        </w:rPr>
+        <w:instrText xml:space="preserve"> MERGEFIELD Cliente </w:instrText>
+      </w:r>
+      <w:r>
+        <w:rPr>
+          <w:rFonts w:ascii="Arial Narrow" w:hAnsi="Arial Narrow"/>
+          <w:b/>
+          <w:sz w:val="32"/>
+          <w:szCs w:val="22"/>
+        </w:rPr>
+        <w:fldChar w:fldCharType="separate"/>
+      </w:r>
+      <w:r>
+        <w:rPr>
+          <w:rFonts w:ascii="Arial Narrow" w:hAnsi="Arial Narrow"/>
+          <w:b/>
+          <w:noProof/>
+          <w:sz w:val="32"/>
+        </w:rPr>
+        <w:t>[NOMBRE_CLIENTE]</w:t>
+      </w:r>
+      <w:r>
+        <w:rPr>
+          <w:rFonts w:ascii="Arial Narrow" w:hAnsi="Arial Narrow"/>
+          <w:b/>
+          <w:sz w:val="32"/>
+          <w:szCs w:val="22"/>
+        </w:rPr>
+        <w:fldChar w:fldCharType="end"/>
       </w:r>
     </w:p>
     <w:p>
@@ -1119,8 +1757,235 @@
         </w:rPr>
       </w:pPr>
       <w:r>
+        <w:rPr>
+          <w:rFonts w:ascii="Arial Narrow" w:hAnsi="Arial Narrow" w:cs="Arial"/>
+          <w:bCs/>
+          <w:sz w:val="24"/>
+          <w:szCs w:val="18"/>
+          <w:lang w:val="pt-BR"/>
+        </w:rPr>
         <w:t>DOMICILIO: [DIRECCION_CLIENTE]</w:t>
       </w:r>
+      <w:r>
+        <w:rPr>
+          <w:rFonts w:ascii="Arial Narrow" w:hAnsi="Arial Narrow" w:cs="Arial"/>
+          <w:bCs/>
+          <w:sz w:val="24"/>
+          <w:szCs w:val="18"/>
+          <w:lang w:val="pt-BR"/>
+        </w:rPr>
+      </w:r>
+      <w:r>
+        <w:rPr>
+          <w:rFonts w:ascii="Arial Narrow" w:hAnsi="Arial Narrow" w:cs="Arial"/>
+          <w:bCs/>
+          <w:sz w:val="24"/>
+          <w:szCs w:val="18"/>
+          <w:lang w:val="pt-BR"/>
+        </w:rPr>
+      </w:r>
+      <w:r>
+        <w:rPr>
+          <w:rFonts w:ascii="Arial Narrow" w:hAnsi="Arial Narrow" w:cs="Arial"/>
+          <w:bCs/>
+          <w:sz w:val="24"/>
+          <w:szCs w:val="18"/>
+          <w:lang w:val="pt-BR"/>
+        </w:rPr>
+      </w:r>
+      <w:r>
+        <w:rPr>
+          <w:rFonts w:ascii="Arial Narrow" w:hAnsi="Arial Narrow" w:cs="Arial"/>
+          <w:bCs/>
+          <w:sz w:val="24"/>
+          <w:szCs w:val="18"/>
+          <w:lang w:val="pt-BR"/>
+        </w:rPr>
+      </w:r>
+      <w:r>
+        <w:rPr>
+          <w:rFonts w:ascii="Arial Narrow" w:hAnsi="Arial Narrow" w:cs="Arial"/>
+          <w:bCs/>
+          <w:noProof/>
+          <w:sz w:val="24"/>
+          <w:szCs w:val="18"/>
+          <w:lang w:val="pt-BR"/>
+        </w:rPr>
+      </w:r>
+      <w:r>
+        <w:rPr>
+          <w:rFonts w:ascii="Arial Narrow" w:hAnsi="Arial Narrow" w:cs="Arial"/>
+          <w:bCs/>
+          <w:sz w:val="24"/>
+          <w:szCs w:val="18"/>
+          <w:lang w:val="pt-BR"/>
+        </w:rPr>
+      </w:r>
+      <w:r>
+        <w:rPr>
+          <w:rFonts w:ascii="Arial Narrow" w:hAnsi="Arial Narrow" w:cs="Arial"/>
+          <w:bCs/>
+          <w:sz w:val="24"/>
+          <w:szCs w:val="18"/>
+          <w:lang w:val="pt-BR"/>
+        </w:rPr>
+      </w:r>
+      <w:r>
+        <w:rPr>
+          <w:rFonts w:ascii="Arial Narrow" w:hAnsi="Arial Narrow" w:cs="Arial"/>
+          <w:bCs/>
+          <w:sz w:val="24"/>
+          <w:szCs w:val="18"/>
+          <w:lang w:val="pt-BR"/>
+        </w:rPr>
+      </w:r>
+      <w:r>
+        <w:rPr>
+          <w:rFonts w:ascii="Arial Narrow" w:hAnsi="Arial Narrow" w:cs="Arial"/>
+          <w:bCs/>
+          <w:sz w:val="24"/>
+          <w:szCs w:val="18"/>
+          <w:lang w:val="pt-BR"/>
+        </w:rPr>
+      </w:r>
+      <w:r>
+        <w:rPr>
+          <w:rFonts w:ascii="Arial Narrow" w:hAnsi="Arial Narrow" w:cs="Arial"/>
+          <w:bCs/>
+          <w:sz w:val="24"/>
+          <w:szCs w:val="18"/>
+          <w:lang w:val="pt-BR"/>
+        </w:rPr>
+      </w:r>
+      <w:r>
+        <w:rPr>
+          <w:rFonts w:ascii="Arial Narrow" w:hAnsi="Arial Narrow" w:cs="Arial"/>
+          <w:bCs/>
+          <w:noProof/>
+          <w:sz w:val="24"/>
+          <w:szCs w:val="18"/>
+          <w:lang w:val="pt-BR"/>
+        </w:rPr>
+      </w:r>
+      <w:r>
+        <w:rPr>
+          <w:rFonts w:ascii="Arial Narrow" w:hAnsi="Arial Narrow" w:cs="Arial"/>
+          <w:bCs/>
+          <w:sz w:val="24"/>
+          <w:szCs w:val="18"/>
+          <w:lang w:val="pt-BR"/>
+        </w:rPr>
+      </w:r>
+      <w:r>
+        <w:rPr>
+          <w:rFonts w:ascii="Arial Narrow" w:hAnsi="Arial Narrow" w:cs="Arial"/>
+          <w:bCs/>
+          <w:sz w:val="24"/>
+          <w:szCs w:val="18"/>
+          <w:lang w:val="pt-BR"/>
+        </w:rPr>
+      </w:r>
+      <w:r>
+        <w:rPr>
+          <w:rFonts w:ascii="Arial Narrow" w:hAnsi="Arial Narrow" w:cs="Arial"/>
+          <w:bCs/>
+          <w:sz w:val="24"/>
+          <w:szCs w:val="18"/>
+          <w:lang w:val="pt-BR"/>
+        </w:rPr>
+      </w:r>
+      <w:r>
+        <w:rPr>
+          <w:rFonts w:ascii="Arial Narrow" w:hAnsi="Arial Narrow" w:cs="Arial"/>
+          <w:bCs/>
+          <w:sz w:val="24"/>
+          <w:szCs w:val="18"/>
+          <w:lang w:val="pt-BR"/>
+        </w:rPr>
+      </w:r>
+      <w:r>
+        <w:rPr>
+          <w:rFonts w:ascii="Arial Narrow" w:hAnsi="Arial Narrow" w:cs="Arial"/>
+          <w:bCs/>
+          <w:sz w:val="24"/>
+          <w:szCs w:val="18"/>
+          <w:lang w:val="pt-BR"/>
+        </w:rPr>
+      </w:r>
+      <w:r>
+        <w:rPr>
+          <w:rFonts w:ascii="Arial Narrow" w:hAnsi="Arial Narrow" w:cs="Arial"/>
+          <w:bCs/>
+          <w:noProof/>
+          <w:sz w:val="24"/>
+          <w:szCs w:val="18"/>
+          <w:lang w:val="pt-BR"/>
+        </w:rPr>
+      </w:r>
+      <w:r>
+        <w:rPr>
+          <w:rFonts w:ascii="Arial Narrow" w:hAnsi="Arial Narrow" w:cs="Arial"/>
+          <w:bCs/>
+          <w:sz w:val="24"/>
+          <w:szCs w:val="18"/>
+          <w:lang w:val="pt-BR"/>
+        </w:rPr>
+      </w:r>
+      <w:r>
+        <w:rPr>
+          <w:rFonts w:ascii="Arial Narrow" w:hAnsi="Arial Narrow" w:cs="Arial"/>
+          <w:bCs/>
+          <w:sz w:val="24"/>
+          <w:szCs w:val="18"/>
+          <w:lang w:val="pt-BR"/>
+        </w:rPr>
+      </w:r>
+      <w:r>
+        <w:rPr>
+          <w:rFonts w:ascii="Arial Narrow" w:hAnsi="Arial Narrow" w:cs="Arial"/>
+          <w:bCs/>
+          <w:sz w:val="24"/>
+          <w:szCs w:val="18"/>
+          <w:lang w:val="pt-BR"/>
+        </w:rPr>
+      </w:r>
+      <w:r>
+        <w:rPr>
+          <w:rFonts w:ascii="Arial Narrow" w:hAnsi="Arial Narrow" w:cs="Arial"/>
+          <w:bCs/>
+          <w:sz w:val="24"/>
+          <w:szCs w:val="18"/>
+          <w:lang w:val="pt-BR"/>
+        </w:rPr>
+      </w:r>
+      <w:r>
+        <w:rPr>
+          <w:rFonts w:ascii="Arial Narrow" w:hAnsi="Arial Narrow" w:cs="Arial"/>
+          <w:bCs/>
+          <w:sz w:val="24"/>
+          <w:szCs w:val="18"/>
+          <w:lang w:val="pt-BR"/>
+        </w:rPr>
+      </w:r>
+      <w:r>
+        <w:rPr>
+          <w:rFonts w:ascii="Arial Narrow" w:hAnsi="Arial Narrow" w:cs="Arial"/>
+          <w:bCs/>
+          <w:noProof/>
+          <w:sz w:val="24"/>
+          <w:szCs w:val="18"/>
+          <w:lang w:val="pt-BR"/>
+        </w:rPr>
+      </w:r>
+      <w:r>
+        <w:rPr>
+          <w:rFonts w:ascii="Arial Narrow" w:hAnsi="Arial Narrow" w:cs="Arial"/>
+          <w:bCs/>
+          <w:sz w:val="24"/>
+          <w:szCs w:val="18"/>
+          <w:lang w:val="pt-BR"/>
+        </w:rPr>
+      </w:r>
     </w:p>
     <w:p>
       <w:pPr>
@@ -1134,7 +1999,68 @@
         </w:rPr>
       </w:pPr>
       <w:r>
-        <w:t>AVAL: [NOMBRE_AVAL]</w:t>
+        <w:rPr>
+          <w:rFonts w:ascii="Arial Narrow" w:hAnsi="Arial Narrow"/>
+          <w:b/>
+          <w:noProof/>
+          <w:szCs w:val="18"/>
+        </w:rPr>
+        <w:t>AVAL:</w:t>
+      </w:r>
+      <w:r>
+        <w:rPr>
+          <w:rFonts w:ascii="Arial Narrow" w:hAnsi="Arial Narrow"/>
+          <w:b/>
+          <w:noProof/>
+          <w:sz w:val="28"/>
+        </w:rPr>
+        <w:t xml:space="preserve"> </w:t>
+      </w:r>
+      <w:r>
+        <w:rPr>
+          <w:rFonts w:ascii="Arial Narrow" w:eastAsia="Arial" w:hAnsi="Arial Narrow" w:cs="Arial"/>
+          <w:b/>
+          <w:sz w:val="32"/>
+          <w:lang w:eastAsia="es-ES"/>
+        </w:rPr>
+        <w:fldChar w:fldCharType="begin"/>
+      </w:r>
+      <w:r>
+        <w:rPr>
+          <w:rFonts w:ascii="Arial Narrow" w:eastAsia="Arial" w:hAnsi="Arial Narrow" w:cs="Arial"/>
+          <w:b/>
+          <w:sz w:val="32"/>
+          <w:lang w:eastAsia="es-ES"/>
+        </w:rPr>
+        <w:instrText xml:space="preserve"> MERGEFIELD Fiador </w:instrText>
+      </w:r>
+      <w:r>
+        <w:rPr>
+          <w:rFonts w:ascii="Arial Narrow" w:eastAsia="Arial" w:hAnsi="Arial Narrow" w:cs="Arial"/>
+          <w:b/>
+          <w:sz w:val="32"/>
+          <w:lang w:eastAsia="es-ES"/>
+        </w:rPr>
+        <w:fldChar w:fldCharType="separate"/>
+      </w:r>
+      <w:r>
+        <w:rPr>
+          <w:rFonts w:ascii="Arial Narrow" w:eastAsia="Arial" w:hAnsi="Arial Narrow" w:cs="Arial"/>
+          <w:b/>
+          <w:noProof/>
+          <w:sz w:val="32"/>
+          <w:lang w:eastAsia="es-ES"/>
+        </w:rPr>
+        <w:t>[NOMBRE_AVAL]</w:t>
+      </w:r>
+      <w:r>
+        <w:rPr>
+          <w:rFonts w:ascii="Arial Narrow" w:eastAsia="Arial" w:hAnsi="Arial Narrow" w:cs="Arial"/>
+          <w:b/>
+          <w:sz w:val="32"/>
+          <w:lang w:eastAsia="es-ES"/>
+        </w:rPr>
+        <w:fldChar w:fldCharType="end"/>
       </w:r>
     </w:p>
     <w:p>
@@ -1150,7 +2076,132 @@
         </w:rPr>
       </w:pPr>
       <w:r>
+        <w:rPr>
+          <w:rFonts w:ascii="Arial Narrow" w:hAnsi="Arial Narrow" w:cs="Arial"/>
+          <w:bCs/>
+          <w:sz w:val="24"/>
+          <w:szCs w:val="18"/>
+          <w:lang w:val="pt-BR"/>
+        </w:rPr>
         <w:t>DOMICILIO:  [DIRECCION_CLIENTE]</w:t>
+      </w:r>
+      <w:r>
+        <w:rPr>
+          <w:rFonts w:ascii="Arial Narrow" w:hAnsi="Arial Narrow"/>
+          <w:bCs/>
+          <w:noProof/>
+          <w:szCs w:val="18"/>
+        </w:rPr>
+      </w:r>
+      <w:r>
+        <w:rPr>
+          <w:rFonts w:ascii="Arial Narrow" w:hAnsi="Arial Narrow" w:cs="Arial"/>
+          <w:bCs/>
+          <w:noProof/>
+          <w:sz w:val="24"/>
+          <w:szCs w:val="18"/>
+          <w:lang w:val="pt-BR"/>
+        </w:rPr>
+      </w:r>
+      <w:r>
+        <w:rPr>
+          <w:rFonts w:ascii="Arial Narrow" w:hAnsi="Arial Narrow" w:cs="Arial"/>
+          <w:bCs/>
+          <w:noProof/>
+          <w:sz w:val="24"/>
+          <w:szCs w:val="18"/>
+          <w:lang w:val="pt-BR"/>
+        </w:rPr>
+      </w:r>
+      <w:r>
+        <w:rPr>
+          <w:rFonts w:ascii="Arial Narrow" w:hAnsi="Arial Narrow" w:cs="Arial"/>
+          <w:bCs/>
+          <w:noProof/>
+          <w:sz w:val="24"/>
+          <w:szCs w:val="18"/>
+          <w:lang w:val="pt-BR"/>
+        </w:rPr>
+      </w:r>
+      <w:r>
+        <w:rPr>
+          <w:rFonts w:ascii="Arial Narrow" w:hAnsi="Arial Narrow" w:cs="Arial"/>
+          <w:bCs/>
+          <w:noProof/>
+          <w:sz w:val="24"/>
+          <w:szCs w:val="18"/>
+          <w:lang w:val="pt-BR"/>
+        </w:rPr>
+      </w:r>
+      <w:r>
+        <w:rPr>
+          <w:rFonts w:ascii="Arial Narrow" w:hAnsi="Arial Narrow" w:cs="Arial"/>
+          <w:bCs/>
+          <w:noProof/>
+          <w:sz w:val="24"/>
+          <w:szCs w:val="18"/>
+          <w:lang w:val="pt-BR"/>
+        </w:rPr>
+      </w:r>
+      <w:r>
+        <w:rPr>
+          <w:rFonts w:ascii="Arial Narrow" w:hAnsi="Arial Narrow" w:cs="Arial"/>
+          <w:bCs/>
+          <w:noProof/>
+          <w:sz w:val="24"/>
+          <w:szCs w:val="18"/>
+          <w:lang w:val="pt-BR"/>
+        </w:rPr>
+      </w:r>
+      <w:r>
+        <w:rPr>
+          <w:rFonts w:ascii="Arial Narrow" w:hAnsi="Arial Narrow" w:cs="Arial"/>
+          <w:bCs/>
+          <w:noProof/>
+          <w:sz w:val="24"/>
+          <w:szCs w:val="18"/>
+          <w:lang w:val="pt-BR"/>
+        </w:rPr>
+      </w:r>
+      <w:r>
+        <w:rPr>
+          <w:rFonts w:ascii="Arial Narrow" w:hAnsi="Arial Narrow" w:cs="Arial"/>
+          <w:bCs/>
+          <w:noProof/>
+          <w:sz w:val="24"/>
+          <w:szCs w:val="18"/>
+          <w:lang w:val="pt-BR"/>
+        </w:rPr>
+      </w:r>
+      <w:r>
+        <w:rPr>
+          <w:rFonts w:ascii="Arial Narrow" w:hAnsi="Arial Narrow" w:cs="Arial"/>
+          <w:bCs/>
+          <w:noProof/>
+          <w:sz w:val="24"/>
+          <w:szCs w:val="18"/>
+          <w:lang w:val="pt-BR"/>
+        </w:rPr>
+      </w:r>
+      <w:r>
+        <w:rPr>
+          <w:rFonts w:ascii="Arial Narrow" w:hAnsi="Arial Narrow" w:cs="Arial"/>
+          <w:bCs/>
+          <w:noProof/>
+          <w:sz w:val="24"/>
+          <w:szCs w:val="18"/>
+          <w:lang w:val="pt-BR"/>
+        </w:rPr>
+      </w:r>
+      <w:r>
+        <w:rPr>
+          <w:rFonts w:ascii="Arial Narrow" w:hAnsi="Arial Narrow" w:cs="Arial"/>
+          <w:bCs/>
+          <w:noProof/>
+          <w:sz w:val="24"/>
+          <w:szCs w:val="18"/>
+          <w:lang w:val="pt-BR"/>
+        </w:rPr>
       </w:r>
     </w:p>
     <w:p>
@@ -1171,7 +2222,78 @@
         </w:rPr>
       </w:pPr>
       <w:r>
-        <w:t xml:space="preserve">AGENCIA:[AGENCIA] </w:t>
+        <w:rPr>
+          <w:rFonts w:ascii="Arial Narrow" w:hAnsi="Arial Narrow" w:cs="Arial"/>
+          <w:bCs/>
+          <w:sz w:val="24"/>
+          <w:szCs w:val="18"/>
+          <w:lang w:val="pt-BR"/>
+        </w:rPr>
+        <w:t>A</w:t>
+      </w:r>
+      <w:r>
+        <w:rPr>
+          <w:rFonts w:ascii="Arial Narrow" w:hAnsi="Arial Narrow" w:cs="Arial"/>
+          <w:bCs/>
+          <w:sz w:val="24"/>
+          <w:szCs w:val="18"/>
+        </w:rPr>
+        <w:t>GENCIA:</w:t>
+      </w:r>
+      <w:r>
+        <w:rPr>
+          <w:rFonts w:ascii="Arial Narrow" w:hAnsi="Arial Narrow" w:cs="Arial"/>
+          <w:bCs/>
+          <w:sz w:val="24"/>
+          <w:szCs w:val="18"/>
+        </w:rPr>
+        <w:fldChar w:fldCharType="begin"/>
+      </w:r>
+      <w:r>
+        <w:rPr>
+          <w:rFonts w:ascii="Arial Narrow" w:hAnsi="Arial Narrow" w:cs="Arial"/>
+          <w:bCs/>
+          <w:sz w:val="24"/>
+          <w:szCs w:val="18"/>
+        </w:rPr>
+        <w:instrText xml:space="preserve"> MERGEFIELD Agencia </w:instrText>
+      </w:r>
+      <w:r>
+        <w:rPr>
+          <w:rFonts w:ascii="Arial Narrow" w:hAnsi="Arial Narrow" w:cs="Arial"/>
+          <w:bCs/>
+          <w:sz w:val="24"/>
+          <w:szCs w:val="18"/>
+        </w:rPr>
+        <w:fldChar w:fldCharType="separate"/>
+      </w:r>
+      <w:r>
+        <w:rPr>
+          <w:rFonts w:ascii="Arial Narrow" w:hAnsi="Arial Narrow" w:cs="Arial"/>
+          <w:bCs/>
+          <w:noProof/>
+          <w:sz w:val="24"/>
+          <w:szCs w:val="18"/>
+        </w:rPr>
+        <w:t>[AGENCIA]</w:t>
+      </w:r>
+      <w:r>
+        <w:rPr>
+          <w:rFonts w:ascii="Arial Narrow" w:hAnsi="Arial Narrow" w:cs="Arial"/>
+          <w:bCs/>
+          <w:sz w:val="24"/>
+          <w:szCs w:val="18"/>
+        </w:rPr>
+        <w:fldChar w:fldCharType="end"/>
+      </w:r>
+      <w:r>
+        <w:rPr>
+          <w:rFonts w:ascii="Arial Narrow" w:hAnsi="Arial Narrow" w:cs="Arial"/>
+          <w:bCs/>
+          <w:sz w:val="24"/>
+          <w:szCs w:val="18"/>
+        </w:rPr>
+        <w:t xml:space="preserve"> </w:t>
       </w:r>
     </w:p>
     <w:p>
@@ -1502,7 +2624,77 @@
               </w:rPr>
             </w:pPr>
             <w:r>
-              <w:t>S/[MONTO_DEUDA]</w:t>
+              <w:rPr>
+                <w:rFonts w:ascii="Calibri" w:eastAsia="Times New Roman" w:hAnsi="Calibri" w:cs="Calibri"/>
+                <w:b/>
+                <w:bCs/>
+                <w:color w:val="000000"/>
+                <w:sz w:val="48"/>
+                <w:szCs w:val="48"/>
+                <w:lang w:eastAsia="es-PE"/>
+              </w:rPr>
+              <w:t>S/</w:t>
+            </w:r>
+            <w:r>
+              <w:rPr>
+                <w:rFonts w:ascii="Calibri" w:eastAsia="Times New Roman" w:hAnsi="Calibri" w:cs="Calibri"/>
+                <w:b/>
+                <w:bCs/>
+                <w:color w:val="000000"/>
+                <w:sz w:val="48"/>
+                <w:szCs w:val="48"/>
+                <w:lang w:eastAsia="es-PE"/>
+              </w:rPr>
+              <w:fldChar w:fldCharType="begin"/>
+            </w:r>
+            <w:r>
+              <w:rPr>
+                <w:rFonts w:ascii="Calibri" w:eastAsia="Times New Roman" w:hAnsi="Calibri" w:cs="Calibri"/>
+                <w:b/>
+                <w:bCs/>
+                <w:color w:val="000000"/>
+                <w:sz w:val="48"/>
+                <w:szCs w:val="48"/>
+                <w:lang w:eastAsia="es-PE"/>
+              </w:rPr>
+              <w:instrText xml:space="preserve"> MERGEFIELD Saldo_Total </w:instrText>
+            </w:r>
+            <w:r>
+              <w:rPr>
+                <w:rFonts w:ascii="Calibri" w:eastAsia="Times New Roman" w:hAnsi="Calibri" w:cs="Calibri"/>
+                <w:b/>
+                <w:bCs/>
+                <w:color w:val="000000"/>
+                <w:sz w:val="48"/>
+                <w:szCs w:val="48"/>
+                <w:lang w:eastAsia="es-PE"/>
+              </w:rPr>
+              <w:fldChar w:fldCharType="separate"/>
+            </w:r>
+            <w:r>
+              <w:rPr>
+                <w:rFonts w:ascii="Calibri" w:eastAsia="Times New Roman" w:hAnsi="Calibri" w:cs="Calibri"/>
+                <w:b/>
+                <w:bCs/>
+                <w:noProof/>
+                <w:color w:val="000000"/>
+                <w:sz w:val="48"/>
+                <w:szCs w:val="48"/>
+                <w:lang w:eastAsia="es-PE"/>
+              </w:rPr>
+              <w:t>[MONTO_DEUDA]</w:t>
+            </w:r>
+            <w:r>
+              <w:rPr>
+                <w:rFonts w:ascii="Calibri" w:eastAsia="Times New Roman" w:hAnsi="Calibri" w:cs="Calibri"/>
+                <w:b/>
+                <w:bCs/>
+                <w:color w:val="000000"/>
+                <w:sz w:val="48"/>
+                <w:szCs w:val="48"/>
+                <w:lang w:eastAsia="es-PE"/>
+              </w:rPr>
+              <w:fldChar w:fldCharType="end"/>
             </w:r>
           </w:p>
         </w:tc>
@@ -1677,7 +2869,7 @@
           <w:sz w:val="32"/>
           <w:szCs w:val="32"/>
         </w:rPr>
-        <w:t>FECHA ULTIMO PAGO:</w:t>
+        <w:t>FECHA ULTIMO PAGO: [FECHA_ULT_PAGO]</w:t>
       </w:r>
       <w:r>
         <w:rPr>
@@ -1687,7 +2879,6 @@
           <w:sz w:val="32"/>
           <w:szCs w:val="32"/>
         </w:rPr>
-        <w:fldChar w:fldCharType="begin"/>
       </w:r>
       <w:r>
         <w:rPr>
@@ -1697,7 +2888,6 @@
           <w:sz w:val="32"/>
           <w:szCs w:val="32"/>
         </w:rPr>
-        <w:instrText xml:space="preserve"> MERGEFIELD Fecha_Ult_Pago </w:instrText>
       </w:r>
       <w:r>
         <w:rPr>
@@ -1707,7 +2897,6 @@
           <w:sz w:val="32"/>
           <w:szCs w:val="32"/>
         </w:rPr>
-        <w:fldChar w:fldCharType="separate"/>
       </w:r>
       <w:r>
         <w:rPr>
@@ -1718,7 +2907,6 @@
           <w:sz w:val="32"/>
           <w:szCs w:val="32"/>
         </w:rPr>
-        <w:t xml:space="preserve"> </w:t>
       </w:r>
       <w:r>
         <w:rPr>
@@ -1729,7 +2917,6 @@
           <w:sz w:val="32"/>
           <w:szCs w:val="32"/>
         </w:rPr>
-        <w:t>/</w:t>
       </w:r>
       <w:r>
         <w:rPr>
@@ -1740,7 +2927,6 @@
           <w:sz w:val="32"/>
           <w:szCs w:val="32"/>
         </w:rPr>
-        <w:t xml:space="preserve"> </w:t>
       </w:r>
       <w:r>
         <w:rPr>
@@ -1751,7 +2937,6 @@
           <w:sz w:val="32"/>
           <w:szCs w:val="32"/>
         </w:rPr>
-        <w:t>/2026</w:t>
       </w:r>
       <w:r>
         <w:rPr>
@@ -1761,7 +2946,6 @@
           <w:sz w:val="32"/>
           <w:szCs w:val="32"/>
         </w:rPr>
-        <w:fldChar w:fldCharType="end"/>
       </w:r>
     </w:p>
     <w:p>
@@ -1814,7 +2998,7 @@
           <w:sz w:val="24"/>
           <w:szCs w:val="24"/>
         </w:rPr>
-        <w:t>N° CARTA:1997-2026-CÓDIGO AG. 099 ASESOR LEGAL EXTERNO: LPG/CMACHYO</w:t>
+        <w:t>N° CARTA:[NRO_CARTA]</w:t>
       </w:r>
       <w:r>
         <w:rPr>
@@ -1988,7 +3172,7 @@
       <w:headerReference w:type="default" r:id="rId9"/>
       <w:footerReference w:type="default" r:id="rId10"/>
       <w:pgSz w:w="11906" w:h="16838"/>
-      <w:pgMar w:top="142" w:right="424" w:bottom="0" w:left="567" w:header="708" w:footer="708" w:gutter="0"/>
+      <w:pgMar w:top="283" w:right="283" w:bottom="283" w:left="283" w:header="708" w:footer="708" w:gutter="0"/>
       <w:pgNumType w:fmt="numberInDash" w:start="1" w:chapStyle="1"/>
       <w:cols w:space="708"/>
       <w:docGrid w:linePitch="360"/>

</xml_diff>